<commit_message>
Personel giriş sistemi, generic rapor altyapısı, template config'ler ve UI güncellemeleri
- Personel girişi email/username desteği, verifySession personel token ayrımı
- plainPassword kaldırıldı (güvenlik)
- HavaTankiRaporu, Rapor, RaporSablonu, KalibrasyonGecmisi modelleri eklendi
- CihazDurum enum ve OlcumCihazi yeni alanları
- Personel listesi kart tasarımına geçirildi, yeni alanlar eklendi
- Generic word servisi ve yardımcı modüller
- Tüm şablon config dosyaları ve güncellenmiş docx şablonları
- Config oluşturma/doğrulama/denetleme scriptleri

Co-Authored-By: Claude Opus 4.6 <noreply@anthropic.com>
</commit_message>
<xml_diff>
--- a/templates/şablonlar/3. İş Makinesi/Arazöz/FR7.2.35 Arasöz Muayene ve Ölçüm Raporu-4.docx
+++ b/templates/şablonlar/3. İş Makinesi/Arazöz/FR7.2.35 Arasöz Muayene ve Ölçüm Raporu-4.docx
@@ -4902,6 +4902,145 @@
             </w:rPr>
             <w:t>14.05.2025</w:t>
           </w:r>
+        </w:p>
+      </w:tc>
+    </w:tr>
+    <w:tr>
+      <w:tc>
+        <w:tcPr>
+          <w:tcW w:w="1255" w:type="dxa"/>
+          <w:tcBorders>
+            <w:top w:val="nil"/>
+            <w:bottom w:val="single" w:sz="4" w:space="0" w:color="auto"/>
+            <w:right w:val="nil"/>
+          </w:tcBorders>
+          <w:shd w:val="clear" w:color="auto" w:fill="auto"/>
+        </w:tcPr>
+        <w:p>
+          <w:pPr>
+            <w:rPr>
+              <w:rFonts w:asciiTheme="minorHAnsi" w:hAnsiTheme="minorHAnsi" w:cs="Tahoma"/>
+              <w:b/>
+              <w:sz w:val="16"/>
+              <w:szCs w:val="16"/>
+              <w:lang w:val="es-ES"/>
+            </w:rPr>
+          </w:pPr>
+          <w:r>
+            <w:rPr>
+              <w:rFonts w:asciiTheme="minorHAnsi" w:hAnsiTheme="minorHAnsi" w:cs="Tahoma"/>
+              <w:b/>
+              <w:sz w:val="16"/>
+              <w:szCs w:val="16"/>
+              <w:lang w:val="es-ES"/>
+            </w:rPr>
+            <w:t>SGK Sicil No :</w:t>
+          </w:r>
+        </w:p>
+      </w:tc>
+      <w:tc>
+        <w:tcPr>
+          <w:tcW w:w="5875" w:type="dxa"/>
+          <w:tcBorders>
+            <w:top w:val="nil"/>
+            <w:left w:val="nil"/>
+            <w:bottom w:val="single" w:sz="4" w:space="0" w:color="auto"/>
+            <w:right w:val="nil"/>
+          </w:tcBorders>
+        </w:tcPr>
+        <w:p>
+          <w:pPr>
+            <w:rPr>
+              <w:rFonts w:asciiTheme="minorHAnsi" w:hAnsiTheme="minorHAnsi" w:cs="Tahoma"/>
+              <w:sz w:val="16"/>
+              <w:szCs w:val="16"/>
+            </w:rPr>
+          </w:pPr>
+        </w:p>
+      </w:tc>
+      <w:tc>
+        <w:tcPr>
+          <w:tcW w:w="1726" w:type="dxa"/>
+          <w:tcBorders>
+            <w:left w:val="nil"/>
+            <w:right w:val="nil"/>
+          </w:tcBorders>
+          <w:shd w:val="clear" w:color="auto" w:fill="auto"/>
+        </w:tcPr>
+        <w:p>
+          <w:pPr>
+            <w:rPr>
+              <w:rFonts w:asciiTheme="minorHAnsi" w:hAnsiTheme="minorHAnsi" w:cs="Tahoma"/>
+              <w:b/>
+              <w:sz w:val="16"/>
+              <w:szCs w:val="16"/>
+              <w:lang w:val="es-ES"/>
+            </w:rPr>
+          </w:pPr>
+          <w:proofErr w:type="spellStart"/>
+          <w:r>
+            <w:rPr>
+              <w:rFonts w:asciiTheme="minorHAnsi" w:hAnsiTheme="minorHAnsi" w:cs="Tahoma"/>
+              <w:b/>
+              <w:bCs/>
+              <w:sz w:val="16"/>
+              <w:szCs w:val="16"/>
+            </w:rPr>
+            <w:t>Sözlesme</w:t>
+          </w:r>
+          <w:proofErr w:type="spellEnd"/>
+          <w:r>
+            <w:rPr>
+              <w:rFonts w:asciiTheme="minorHAnsi" w:hAnsiTheme="minorHAnsi" w:cs="Tahoma"/>
+              <w:b/>
+              <w:bCs/>
+              <w:sz w:val="16"/>
+              <w:szCs w:val="16"/>
+            </w:rPr>
+            <w:t xml:space="preserve"> ID</w:t>
+          </w:r>
+          <w:r>
+            <w:rPr>
+              <w:rFonts w:asciiTheme="minorHAnsi" w:hAnsiTheme="minorHAnsi" w:cs="Tahoma"/>
+              <w:b/>
+              <w:bCs/>
+              <w:sz w:val="16"/>
+              <w:szCs w:val="16"/>
+            </w:rPr>
+            <w:t xml:space="preserve">               </w:t>
+          </w:r>
+          <w:proofErr w:type="gramStart"/>
+          <w:r>
+            <w:rPr>
+              <w:rFonts w:asciiTheme="minorHAnsi" w:hAnsiTheme="minorHAnsi" w:cs="Tahoma"/>
+              <w:b/>
+              <w:bCs/>
+              <w:sz w:val="16"/>
+              <w:szCs w:val="16"/>
+            </w:rPr>
+            <w:t xml:space="preserve">  :</w:t>
+          </w:r>
+          <w:proofErr w:type="gramEnd"/>
+        </w:p>
+      </w:tc>
+      <w:tc>
+        <w:tcPr>
+          <w:tcW w:w="1918" w:type="dxa"/>
+          <w:tcBorders>
+            <w:top w:val="nil"/>
+            <w:left w:val="nil"/>
+            <w:bottom w:val="single" w:sz="4" w:space="0" w:color="auto"/>
+          </w:tcBorders>
+        </w:tcPr>
+        <w:p>
+          <w:pPr>
+            <w:rPr>
+              <w:rFonts w:asciiTheme="minorHAnsi" w:hAnsiTheme="minorHAnsi" w:cs="Tahoma"/>
+              <w:color w:val="000000" w:themeColor="text1"/>
+              <w:sz w:val="16"/>
+              <w:szCs w:val="16"/>
+            </w:rPr>
+          </w:pPr>
         </w:p>
       </w:tc>
     </w:tr>

</xml_diff>